<commit_message>
Parcial 1 - evidencias
</commit_message>
<xml_diff>
--- a/Parcial01/Parcial1/Evidencias/Evidencias Cajero automatico.docx
+++ b/Parcial01/Parcial1/Evidencias/Evidencias Cajero automatico.docx
@@ -3,70 +3,15 @@
 <w:document xmlns:wpc="http://schemas.microsoft.com/office/word/2010/wordprocessingCanvas" xmlns:cx="http://schemas.microsoft.com/office/drawing/2014/chartex" xmlns:cx1="http://schemas.microsoft.com/office/drawing/2015/9/8/chartex" xmlns:cx2="http://schemas.microsoft.com/office/drawing/2015/10/21/chartex" xmlns:cx3="http://schemas.microsoft.com/office/drawing/2016/5/9/chartex" xmlns:cx4="http://schemas.microsoft.com/office/drawing/2016/5/10/chartex" xmlns:cx5="http://schemas.microsoft.com/office/drawing/2016/5/11/chartex" xmlns:cx6="http://schemas.microsoft.com/office/drawing/2016/5/12/chartex" xmlns:cx7="http://schemas.microsoft.com/office/drawing/2016/5/13/chartex" xmlns:cx8="http://schemas.microsoft.com/office/drawing/2016/5/14/chartex" xmlns:mc="http://schemas.openxmlformats.org/markup-compatibility/2006" xmlns:aink="http://schemas.microsoft.com/office/drawing/2016/ink" xmlns:am3d="http://schemas.microsoft.com/office/drawing/2017/model3d" xmlns:o="urn:schemas-microsoft-com:office:office" xmlns:oel="http://schemas.microsoft.com/office/2019/extlst" xmlns:r="http://schemas.openxmlformats.org/officeDocument/2006/relationships" xmlns:m="http://schemas.openxmlformats.org/officeDocument/2006/math" xmlns:v="urn:schemas-microsoft-com:vml" xmlns:wp14="http://schemas.microsoft.com/office/word/2010/wordprocessingDrawing" xmlns:wp="http://schemas.openxmlformats.org/drawingml/2006/wordprocessingDrawing" xmlns:w10="urn:schemas-microsoft-com:office:word" xmlns:w="http://schemas.openxmlformats.org/wordprocessingml/2006/main" xmlns:w14="http://schemas.microsoft.com/office/word/2010/wordml" xmlns:w15="http://schemas.microsoft.com/office/word/2012/wordml" xmlns:w16cei="http://schemas.microsoft.com/office/word/2026/wordml/cei" xmlns:w16cex="http://schemas.microsoft.com/office/word/2018/wordml/cex" xmlns:w16cid="http://schemas.microsoft.com/office/word/2016/wordml/cid" xmlns:w16="http://schemas.microsoft.com/office/word/2018/wordml" xmlns:w16du="http://schemas.microsoft.com/office/word/2023/wordml/word16du" xmlns:w16sdtdh="http://schemas.microsoft.com/office/word/2020/wordml/sdtdatahash" xmlns:w16sdtfl="http://schemas.microsoft.com/office/word/2024/wordml/sdtformatlock" xmlns:w16se="http://schemas.microsoft.com/office/word/2015/wordml/symex" xmlns:wpg="http://schemas.microsoft.com/office/word/2010/wordprocessingGroup" xmlns:wpi="http://schemas.microsoft.com/office/word/2010/wordprocessingInk" xmlns:wne="http://schemas.microsoft.com/office/word/2006/wordml" xmlns:wps="http://schemas.microsoft.com/office/word/2010/wordprocessingShape" mc:Ignorable="w14 w15 w16se w16cid w16 w16cex w16sdtdh w16sdtfl w16du wp14">
   <w:body>
     <w:p>
-      <w:pPr>
-        <w:rPr>
-          <w:lang w:val="es-MX"/>
-        </w:rPr>
-      </w:pPr>
       <w:r>
         <w:rPr>
-          <w:lang w:val="es-MX"/>
-        </w:rPr>
-        <w:t>CAJERO AUTOMATICO</w:t>
-      </w:r>
-    </w:p>
-    <w:p>
-      <w:pPr>
-        <w:rPr>
-          <w:lang w:val="es-MX"/>
-        </w:rPr>
-      </w:pPr>
-    </w:p>
-    <w:p>
-      <w:pPr>
-        <w:rPr>
-          <w:lang w:val="es-MX"/>
-        </w:rPr>
-      </w:pPr>
-      <w:r>
-        <w:rPr>
-          <w:lang w:val="es-MX"/>
-        </w:rPr>
-        <w:t>EVIDENCIAS</w:t>
-      </w:r>
-    </w:p>
-    <w:p>
-      <w:pPr>
-        <w:rPr>
-          <w:b/>
-          <w:bCs/>
-          <w:lang w:val="es-MX"/>
-        </w:rPr>
-      </w:pPr>
-      <w:r>
-        <w:rPr>
-          <w:b/>
-          <w:bCs/>
-          <w:lang w:val="es-MX"/>
-        </w:rPr>
-        <w:t>Prueba de ping incorrecto</w:t>
-      </w:r>
-    </w:p>
-    <w:p>
-      <w:pPr>
-        <w:rPr>
-          <w:lang w:val="es-MX"/>
-        </w:rPr>
-      </w:pPr>
-      <w:r>
-        <w:rPr>
-          <w:lang w:val="es-MX"/>
+          <w:noProof/>
         </w:rPr>
         <w:drawing>
-          <wp:inline distT="0" distB="0" distL="0" distR="0" wp14:anchorId="0AF9EF96" wp14:editId="645E5FC9">
-            <wp:extent cx="5612130" cy="2212975"/>
-            <wp:effectExtent l="0" t="0" r="7620" b="0"/>
-            <wp:docPr id="1916451269" name="Imagen 1"/>
+          <wp:inline distT="0" distB="0" distL="0" distR="0" wp14:anchorId="3B23177B" wp14:editId="55B64E6A">
+            <wp:extent cx="5612130" cy="4511675"/>
+            <wp:effectExtent l="0" t="0" r="7620" b="3175"/>
+            <wp:docPr id="684495092" name="Imagen 1"/>
             <wp:cNvGraphicFramePr>
               <a:graphicFrameLocks xmlns:a="http://schemas.openxmlformats.org/drawingml/2006/main" noChangeAspect="1"/>
             </wp:cNvGraphicFramePr>
@@ -74,7 +19,7 @@
               <a:graphicData uri="http://schemas.openxmlformats.org/drawingml/2006/picture">
                 <pic:pic xmlns:pic="http://schemas.openxmlformats.org/drawingml/2006/picture">
                   <pic:nvPicPr>
-                    <pic:cNvPr id="1916451269" name=""/>
+                    <pic:cNvPr id="684495092" name=""/>
                     <pic:cNvPicPr/>
                   </pic:nvPicPr>
                   <pic:blipFill>
@@ -86,7 +31,7 @@
                   <pic:spPr>
                     <a:xfrm>
                       <a:off x="0" y="0"/>
-                      <a:ext cx="5612130" cy="2212975"/>
+                      <a:ext cx="5612130" cy="4511675"/>
                     </a:xfrm>
                     <a:prstGeom prst="rect">
                       <a:avLst/>
@@ -100,33 +45,16 @@
       </w:r>
     </w:p>
     <w:p>
-      <w:pPr>
-        <w:rPr>
-          <w:lang w:val="es-MX"/>
-        </w:rPr>
-      </w:pPr>
       <w:r>
         <w:rPr>
-          <w:lang w:val="es-MX"/>
+          <w:noProof/>
         </w:rPr>
-        <w:t>Prueba de movimientos</w:t>
-      </w:r>
-    </w:p>
-    <w:p>
-      <w:pPr>
-        <w:rPr>
-          <w:lang w:val="es-MX"/>
-        </w:rPr>
-      </w:pPr>
-      <w:r>
-        <w:rPr>
-          <w:lang w:val="es-MX"/>
-        </w:rPr>
+        <w:lastRenderedPageBreak/>
         <w:drawing>
-          <wp:inline distT="0" distB="0" distL="0" distR="0" wp14:anchorId="494DD46D" wp14:editId="49DB2713">
-            <wp:extent cx="5612130" cy="3646170"/>
-            <wp:effectExtent l="0" t="0" r="7620" b="0"/>
-            <wp:docPr id="1502126865" name="Imagen 1"/>
+          <wp:inline distT="0" distB="0" distL="0" distR="0" wp14:anchorId="4413EBA4" wp14:editId="4B43C5D3">
+            <wp:extent cx="4695238" cy="4923809"/>
+            <wp:effectExtent l="0" t="0" r="0" b="0"/>
+            <wp:docPr id="1898693747" name="Imagen 1"/>
             <wp:cNvGraphicFramePr>
               <a:graphicFrameLocks xmlns:a="http://schemas.openxmlformats.org/drawingml/2006/main" noChangeAspect="1"/>
             </wp:cNvGraphicFramePr>
@@ -134,7 +62,7 @@
               <a:graphicData uri="http://schemas.openxmlformats.org/drawingml/2006/picture">
                 <pic:pic xmlns:pic="http://schemas.openxmlformats.org/drawingml/2006/picture">
                   <pic:nvPicPr>
-                    <pic:cNvPr id="1502126865" name=""/>
+                    <pic:cNvPr id="1898693747" name=""/>
                     <pic:cNvPicPr/>
                   </pic:nvPicPr>
                   <pic:blipFill>
@@ -146,7 +74,7 @@
                   <pic:spPr>
                     <a:xfrm>
                       <a:off x="0" y="0"/>
-                      <a:ext cx="5612130" cy="3646170"/>
+                      <a:ext cx="4695238" cy="4923809"/>
                     </a:xfrm>
                     <a:prstGeom prst="rect">
                       <a:avLst/>
@@ -160,76 +88,16 @@
       </w:r>
     </w:p>
     <w:p>
-      <w:pPr>
-        <w:rPr>
-          <w:lang w:val="es-MX"/>
-        </w:rPr>
-      </w:pPr>
-    </w:p>
-    <w:p>
-      <w:pPr>
-        <w:rPr>
-          <w:lang w:val="es-MX"/>
-        </w:rPr>
-      </w:pPr>
-    </w:p>
-    <w:p>
-      <w:pPr>
-        <w:rPr>
-          <w:lang w:val="es-MX"/>
-        </w:rPr>
-      </w:pPr>
-    </w:p>
-    <w:p>
-      <w:pPr>
-        <w:rPr>
-          <w:lang w:val="es-MX"/>
-        </w:rPr>
-      </w:pPr>
-    </w:p>
-    <w:p>
-      <w:pPr>
-        <w:rPr>
-          <w:lang w:val="es-MX"/>
-        </w:rPr>
-      </w:pPr>
-    </w:p>
-    <w:p>
-      <w:pPr>
-        <w:rPr>
-          <w:lang w:val="es-MX"/>
-        </w:rPr>
-      </w:pPr>
-    </w:p>
-    <w:p>
-      <w:pPr>
-        <w:rPr>
-          <w:lang w:val="es-MX"/>
-        </w:rPr>
-      </w:pPr>
-      <w:r>
-        <w:rPr>
-          <w:lang w:val="es-MX"/>
-        </w:rPr>
-        <w:t>PRUEBA DE BOTONES</w:t>
-      </w:r>
-    </w:p>
-    <w:p>
-      <w:pPr>
-        <w:rPr>
-          <w:lang w:val="es-MX"/>
-        </w:rPr>
-      </w:pPr>
       <w:r>
         <w:rPr>
           <w:noProof/>
-          <w:lang w:val="es-MX"/>
         </w:rPr>
+        <w:lastRenderedPageBreak/>
         <w:drawing>
-          <wp:inline distT="0" distB="0" distL="0" distR="0" wp14:anchorId="7776D6B2" wp14:editId="25175FDB">
-            <wp:extent cx="5612130" cy="2913380"/>
-            <wp:effectExtent l="0" t="0" r="7620" b="1270"/>
-            <wp:docPr id="55552454" name="Imagen 1"/>
+          <wp:inline distT="0" distB="0" distL="0" distR="0" wp14:anchorId="0164C63C" wp14:editId="12158C05">
+            <wp:extent cx="4514286" cy="5066667"/>
+            <wp:effectExtent l="0" t="0" r="635" b="635"/>
+            <wp:docPr id="606758979" name="Imagen 1"/>
             <wp:cNvGraphicFramePr>
               <a:graphicFrameLocks xmlns:a="http://schemas.openxmlformats.org/drawingml/2006/main" noChangeAspect="1"/>
             </wp:cNvGraphicFramePr>
@@ -237,7 +105,7 @@
               <a:graphicData uri="http://schemas.openxmlformats.org/drawingml/2006/picture">
                 <pic:pic xmlns:pic="http://schemas.openxmlformats.org/drawingml/2006/picture">
                   <pic:nvPicPr>
-                    <pic:cNvPr id="55552454" name=""/>
+                    <pic:cNvPr id="606758979" name=""/>
                     <pic:cNvPicPr/>
                   </pic:nvPicPr>
                   <pic:blipFill>
@@ -249,131 +117,7 @@
                   <pic:spPr>
                     <a:xfrm>
                       <a:off x="0" y="0"/>
-                      <a:ext cx="5612130" cy="2913380"/>
-                    </a:xfrm>
-                    <a:prstGeom prst="rect">
-                      <a:avLst/>
-                    </a:prstGeom>
-                  </pic:spPr>
-                </pic:pic>
-              </a:graphicData>
-            </a:graphic>
-          </wp:inline>
-        </w:drawing>
-      </w:r>
-      <w:r>
-        <w:rPr>
-          <w:noProof/>
-          <w:lang w:val="es-MX"/>
-        </w:rPr>
-        <w:drawing>
-          <wp:inline distT="0" distB="0" distL="0" distR="0" wp14:anchorId="0CC50B56" wp14:editId="7E508D3F">
-            <wp:extent cx="5612130" cy="2778125"/>
-            <wp:effectExtent l="0" t="0" r="7620" b="3175"/>
-            <wp:docPr id="1236113230" name="Imagen 1"/>
-            <wp:cNvGraphicFramePr>
-              <a:graphicFrameLocks xmlns:a="http://schemas.openxmlformats.org/drawingml/2006/main" noChangeAspect="1"/>
-            </wp:cNvGraphicFramePr>
-            <a:graphic xmlns:a="http://schemas.openxmlformats.org/drawingml/2006/main">
-              <a:graphicData uri="http://schemas.openxmlformats.org/drawingml/2006/picture">
-                <pic:pic xmlns:pic="http://schemas.openxmlformats.org/drawingml/2006/picture">
-                  <pic:nvPicPr>
-                    <pic:cNvPr id="1236113230" name=""/>
-                    <pic:cNvPicPr/>
-                  </pic:nvPicPr>
-                  <pic:blipFill>
-                    <a:blip r:embed="rId7"/>
-                    <a:stretch>
-                      <a:fillRect/>
-                    </a:stretch>
-                  </pic:blipFill>
-                  <pic:spPr>
-                    <a:xfrm>
-                      <a:off x="0" y="0"/>
-                      <a:ext cx="5612130" cy="2778125"/>
-                    </a:xfrm>
-                    <a:prstGeom prst="rect">
-                      <a:avLst/>
-                    </a:prstGeom>
-                  </pic:spPr>
-                </pic:pic>
-              </a:graphicData>
-            </a:graphic>
-          </wp:inline>
-        </w:drawing>
-      </w:r>
-      <w:r>
-        <w:rPr>
-          <w:noProof/>
-          <w:lang w:val="es-MX"/>
-        </w:rPr>
-        <w:lastRenderedPageBreak/>
-        <w:drawing>
-          <wp:inline distT="0" distB="0" distL="0" distR="0" wp14:anchorId="7347B420" wp14:editId="20D634C6">
-            <wp:extent cx="5612130" cy="2884805"/>
-            <wp:effectExtent l="0" t="0" r="7620" b="0"/>
-            <wp:docPr id="148587649" name="Imagen 1"/>
-            <wp:cNvGraphicFramePr>
-              <a:graphicFrameLocks xmlns:a="http://schemas.openxmlformats.org/drawingml/2006/main" noChangeAspect="1"/>
-            </wp:cNvGraphicFramePr>
-            <a:graphic xmlns:a="http://schemas.openxmlformats.org/drawingml/2006/main">
-              <a:graphicData uri="http://schemas.openxmlformats.org/drawingml/2006/picture">
-                <pic:pic xmlns:pic="http://schemas.openxmlformats.org/drawingml/2006/picture">
-                  <pic:nvPicPr>
-                    <pic:cNvPr id="148587649" name=""/>
-                    <pic:cNvPicPr/>
-                  </pic:nvPicPr>
-                  <pic:blipFill>
-                    <a:blip r:embed="rId8"/>
-                    <a:stretch>
-                      <a:fillRect/>
-                    </a:stretch>
-                  </pic:blipFill>
-                  <pic:spPr>
-                    <a:xfrm>
-                      <a:off x="0" y="0"/>
-                      <a:ext cx="5612130" cy="2884805"/>
-                    </a:xfrm>
-                    <a:prstGeom prst="rect">
-                      <a:avLst/>
-                    </a:prstGeom>
-                  </pic:spPr>
-                </pic:pic>
-              </a:graphicData>
-            </a:graphic>
-          </wp:inline>
-        </w:drawing>
-      </w:r>
-      <w:r>
-        <w:rPr>
-          <w:noProof/>
-          <w:lang w:val="es-MX"/>
-        </w:rPr>
-        <w:drawing>
-          <wp:inline distT="0" distB="0" distL="0" distR="0" wp14:anchorId="54B3613A" wp14:editId="00A5CAFC">
-            <wp:extent cx="5612130" cy="2628265"/>
-            <wp:effectExtent l="0" t="0" r="7620" b="635"/>
-            <wp:docPr id="835500275" name="Imagen 1"/>
-            <wp:cNvGraphicFramePr>
-              <a:graphicFrameLocks xmlns:a="http://schemas.openxmlformats.org/drawingml/2006/main" noChangeAspect="1"/>
-            </wp:cNvGraphicFramePr>
-            <a:graphic xmlns:a="http://schemas.openxmlformats.org/drawingml/2006/main">
-              <a:graphicData uri="http://schemas.openxmlformats.org/drawingml/2006/picture">
-                <pic:pic xmlns:pic="http://schemas.openxmlformats.org/drawingml/2006/picture">
-                  <pic:nvPicPr>
-                    <pic:cNvPr id="835500275" name=""/>
-                    <pic:cNvPicPr/>
-                  </pic:nvPicPr>
-                  <pic:blipFill>
-                    <a:blip r:embed="rId9"/>
-                    <a:stretch>
-                      <a:fillRect/>
-                    </a:stretch>
-                  </pic:blipFill>
-                  <pic:spPr>
-                    <a:xfrm>
-                      <a:off x="0" y="0"/>
-                      <a:ext cx="5612130" cy="2628265"/>
+                      <a:ext cx="4514286" cy="5066667"/>
                     </a:xfrm>
                     <a:prstGeom prst="rect">
                       <a:avLst/>
@@ -387,55 +131,16 @@
       </w:r>
     </w:p>
     <w:p>
-      <w:pPr>
-        <w:rPr>
-          <w:lang w:val="es-MX"/>
-        </w:rPr>
-      </w:pPr>
-      <w:r>
-        <w:rPr>
-          <w:lang w:val="es-MX"/>
-        </w:rPr>
-        <w:t xml:space="preserve">Prueba de </w:t>
-      </w:r>
-      <w:proofErr w:type="spellStart"/>
-      <w:r>
-        <w:rPr>
-          <w:lang w:val="es-MX"/>
-        </w:rPr>
-        <w:t>deposito</w:t>
-      </w:r>
-      <w:proofErr w:type="spellEnd"/>
-      <w:r>
-        <w:rPr>
-          <w:lang w:val="es-MX"/>
-        </w:rPr>
-        <w:t xml:space="preserve"> de dinero y consulta de saldo</w:t>
-      </w:r>
-    </w:p>
-    <w:p>
-      <w:pPr>
-        <w:rPr>
-          <w:lang w:val="es-MX"/>
-        </w:rPr>
-      </w:pPr>
-      <w:r>
-        <w:rPr>
-          <w:lang w:val="es-MX"/>
-        </w:rPr>
-        <w:lastRenderedPageBreak/>
-        <w:t>Se depositaron 250</w:t>
-      </w:r>
       <w:r>
         <w:rPr>
           <w:noProof/>
-          <w:lang w:val="es-MX"/>
         </w:rPr>
+        <w:lastRenderedPageBreak/>
         <w:drawing>
-          <wp:inline distT="0" distB="0" distL="0" distR="0" wp14:anchorId="7368E203" wp14:editId="19B37D56">
-            <wp:extent cx="5612130" cy="2484755"/>
-            <wp:effectExtent l="0" t="0" r="7620" b="0"/>
-            <wp:docPr id="121437862" name="Imagen 1"/>
+          <wp:inline distT="0" distB="0" distL="0" distR="0" wp14:anchorId="4FE213F0" wp14:editId="2F23CE95">
+            <wp:extent cx="5171429" cy="4876190"/>
+            <wp:effectExtent l="0" t="0" r="0" b="635"/>
+            <wp:docPr id="8299423" name="Imagen 1"/>
             <wp:cNvGraphicFramePr>
               <a:graphicFrameLocks xmlns:a="http://schemas.openxmlformats.org/drawingml/2006/main" noChangeAspect="1"/>
             </wp:cNvGraphicFramePr>
@@ -443,11 +148,11 @@
               <a:graphicData uri="http://schemas.openxmlformats.org/drawingml/2006/picture">
                 <pic:pic xmlns:pic="http://schemas.openxmlformats.org/drawingml/2006/picture">
                   <pic:nvPicPr>
-                    <pic:cNvPr id="121437862" name=""/>
+                    <pic:cNvPr id="8299423" name=""/>
                     <pic:cNvPicPr/>
                   </pic:nvPicPr>
                   <pic:blipFill>
-                    <a:blip r:embed="rId10"/>
+                    <a:blip r:embed="rId7"/>
                     <a:stretch>
                       <a:fillRect/>
                     </a:stretch>
@@ -455,7 +160,7 @@
                   <pic:spPr>
                     <a:xfrm>
                       <a:off x="0" y="0"/>
-                      <a:ext cx="5612130" cy="2484755"/>
+                      <a:ext cx="5171429" cy="4876190"/>
                     </a:xfrm>
                     <a:prstGeom prst="rect">
                       <a:avLst/>
@@ -469,40 +174,16 @@
       </w:r>
     </w:p>
     <w:p>
-      <w:pPr>
-        <w:rPr>
-          <w:lang w:val="es-MX"/>
-        </w:rPr>
-      </w:pPr>
-    </w:p>
-    <w:p>
-      <w:pPr>
-        <w:rPr>
-          <w:lang w:val="es-MX"/>
-        </w:rPr>
-      </w:pPr>
       <w:r>
         <w:rPr>
-          <w:lang w:val="es-MX"/>
+          <w:noProof/>
         </w:rPr>
-        <w:t>Prueba de retiro de dinero</w:t>
-      </w:r>
-    </w:p>
-    <w:p>
-      <w:pPr>
-        <w:rPr>
-          <w:lang w:val="es-MX"/>
-        </w:rPr>
-      </w:pPr>
-      <w:r>
-        <w:rPr>
-          <w:lang w:val="es-MX"/>
-        </w:rPr>
+        <w:lastRenderedPageBreak/>
         <w:drawing>
-          <wp:inline distT="0" distB="0" distL="0" distR="0" wp14:anchorId="36D3DA16" wp14:editId="0C502970">
-            <wp:extent cx="5612130" cy="2563495"/>
-            <wp:effectExtent l="0" t="0" r="7620" b="8255"/>
-            <wp:docPr id="1879227511" name="Imagen 1"/>
+          <wp:inline distT="0" distB="0" distL="0" distR="0" wp14:anchorId="5BF85578" wp14:editId="60F3CA96">
+            <wp:extent cx="4695238" cy="4647619"/>
+            <wp:effectExtent l="0" t="0" r="0" b="635"/>
+            <wp:docPr id="1133262374" name="Imagen 1"/>
             <wp:cNvGraphicFramePr>
               <a:graphicFrameLocks xmlns:a="http://schemas.openxmlformats.org/drawingml/2006/main" noChangeAspect="1"/>
             </wp:cNvGraphicFramePr>
@@ -510,11 +191,11 @@
               <a:graphicData uri="http://schemas.openxmlformats.org/drawingml/2006/picture">
                 <pic:pic xmlns:pic="http://schemas.openxmlformats.org/drawingml/2006/picture">
                   <pic:nvPicPr>
-                    <pic:cNvPr id="1879227511" name=""/>
+                    <pic:cNvPr id="1133262374" name=""/>
                     <pic:cNvPicPr/>
                   </pic:nvPicPr>
                   <pic:blipFill>
-                    <a:blip r:embed="rId11"/>
+                    <a:blip r:embed="rId8"/>
                     <a:stretch>
                       <a:fillRect/>
                     </a:stretch>
@@ -522,7 +203,7 @@
                   <pic:spPr>
                     <a:xfrm>
                       <a:off x="0" y="0"/>
-                      <a:ext cx="5612130" cy="2563495"/>
+                      <a:ext cx="4695238" cy="4647619"/>
                     </a:xfrm>
                     <a:prstGeom prst="rect">
                       <a:avLst/>
@@ -536,34 +217,16 @@
       </w:r>
     </w:p>
     <w:p>
-      <w:pPr>
-        <w:rPr>
-          <w:lang w:val="es-MX"/>
-        </w:rPr>
-      </w:pPr>
       <w:r>
         <w:rPr>
-          <w:lang w:val="es-MX"/>
-        </w:rPr>
-        <w:t>Error fondos Insuficientes</w:t>
-      </w:r>
-    </w:p>
-    <w:p>
-      <w:pPr>
-        <w:rPr>
-          <w:lang w:val="es-MX"/>
-        </w:rPr>
-      </w:pPr>
-      <w:r>
-        <w:rPr>
-          <w:lang w:val="es-MX"/>
+          <w:noProof/>
         </w:rPr>
         <w:lastRenderedPageBreak/>
         <w:drawing>
-          <wp:inline distT="0" distB="0" distL="0" distR="0" wp14:anchorId="2FACC5B7" wp14:editId="26DCE84C">
-            <wp:extent cx="5612130" cy="2230755"/>
-            <wp:effectExtent l="0" t="0" r="7620" b="0"/>
-            <wp:docPr id="335651192" name="Imagen 1"/>
+          <wp:inline distT="0" distB="0" distL="0" distR="0" wp14:anchorId="77E70E6A" wp14:editId="7620E05B">
+            <wp:extent cx="4733333" cy="5895238"/>
+            <wp:effectExtent l="0" t="0" r="0" b="0"/>
+            <wp:docPr id="1092143961" name="Imagen 1"/>
             <wp:cNvGraphicFramePr>
               <a:graphicFrameLocks xmlns:a="http://schemas.openxmlformats.org/drawingml/2006/main" noChangeAspect="1"/>
             </wp:cNvGraphicFramePr>
@@ -571,7 +234,179 @@
               <a:graphicData uri="http://schemas.openxmlformats.org/drawingml/2006/picture">
                 <pic:pic xmlns:pic="http://schemas.openxmlformats.org/drawingml/2006/picture">
                   <pic:nvPicPr>
-                    <pic:cNvPr id="335651192" name=""/>
+                    <pic:cNvPr id="1092143961" name=""/>
+                    <pic:cNvPicPr/>
+                  </pic:nvPicPr>
+                  <pic:blipFill>
+                    <a:blip r:embed="rId9"/>
+                    <a:stretch>
+                      <a:fillRect/>
+                    </a:stretch>
+                  </pic:blipFill>
+                  <pic:spPr>
+                    <a:xfrm>
+                      <a:off x="0" y="0"/>
+                      <a:ext cx="4733333" cy="5895238"/>
+                    </a:xfrm>
+                    <a:prstGeom prst="rect">
+                      <a:avLst/>
+                    </a:prstGeom>
+                  </pic:spPr>
+                </pic:pic>
+              </a:graphicData>
+            </a:graphic>
+          </wp:inline>
+        </w:drawing>
+      </w:r>
+    </w:p>
+    <w:p>
+      <w:r>
+        <w:rPr>
+          <w:noProof/>
+        </w:rPr>
+        <w:lastRenderedPageBreak/>
+        <w:drawing>
+          <wp:inline distT="0" distB="0" distL="0" distR="0" wp14:anchorId="30C7C2A6" wp14:editId="42A00663">
+            <wp:extent cx="5612130" cy="5645150"/>
+            <wp:effectExtent l="0" t="0" r="7620" b="0"/>
+            <wp:docPr id="118496374" name="Imagen 1"/>
+            <wp:cNvGraphicFramePr>
+              <a:graphicFrameLocks xmlns:a="http://schemas.openxmlformats.org/drawingml/2006/main" noChangeAspect="1"/>
+            </wp:cNvGraphicFramePr>
+            <a:graphic xmlns:a="http://schemas.openxmlformats.org/drawingml/2006/main">
+              <a:graphicData uri="http://schemas.openxmlformats.org/drawingml/2006/picture">
+                <pic:pic xmlns:pic="http://schemas.openxmlformats.org/drawingml/2006/picture">
+                  <pic:nvPicPr>
+                    <pic:cNvPr id="118496374" name=""/>
+                    <pic:cNvPicPr/>
+                  </pic:nvPicPr>
+                  <pic:blipFill>
+                    <a:blip r:embed="rId10"/>
+                    <a:stretch>
+                      <a:fillRect/>
+                    </a:stretch>
+                  </pic:blipFill>
+                  <pic:spPr>
+                    <a:xfrm>
+                      <a:off x="0" y="0"/>
+                      <a:ext cx="5612130" cy="5645150"/>
+                    </a:xfrm>
+                    <a:prstGeom prst="rect">
+                      <a:avLst/>
+                    </a:prstGeom>
+                  </pic:spPr>
+                </pic:pic>
+              </a:graphicData>
+            </a:graphic>
+          </wp:inline>
+        </w:drawing>
+      </w:r>
+    </w:p>
+    <w:p>
+      <w:r>
+        <w:rPr>
+          <w:noProof/>
+        </w:rPr>
+        <w:lastRenderedPageBreak/>
+        <w:drawing>
+          <wp:inline distT="0" distB="0" distL="0" distR="0" wp14:anchorId="15C80F92" wp14:editId="370A0292">
+            <wp:extent cx="5523809" cy="5133333"/>
+            <wp:effectExtent l="0" t="0" r="1270" b="0"/>
+            <wp:docPr id="1612629239" name="Imagen 1"/>
+            <wp:cNvGraphicFramePr>
+              <a:graphicFrameLocks xmlns:a="http://schemas.openxmlformats.org/drawingml/2006/main" noChangeAspect="1"/>
+            </wp:cNvGraphicFramePr>
+            <a:graphic xmlns:a="http://schemas.openxmlformats.org/drawingml/2006/main">
+              <a:graphicData uri="http://schemas.openxmlformats.org/drawingml/2006/picture">
+                <pic:pic xmlns:pic="http://schemas.openxmlformats.org/drawingml/2006/picture">
+                  <pic:nvPicPr>
+                    <pic:cNvPr id="1612629239" name=""/>
+                    <pic:cNvPicPr/>
+                  </pic:nvPicPr>
+                  <pic:blipFill>
+                    <a:blip r:embed="rId11"/>
+                    <a:stretch>
+                      <a:fillRect/>
+                    </a:stretch>
+                  </pic:blipFill>
+                  <pic:spPr>
+                    <a:xfrm>
+                      <a:off x="0" y="0"/>
+                      <a:ext cx="5523809" cy="5133333"/>
+                    </a:xfrm>
+                    <a:prstGeom prst="rect">
+                      <a:avLst/>
+                    </a:prstGeom>
+                  </pic:spPr>
+                </pic:pic>
+              </a:graphicData>
+            </a:graphic>
+          </wp:inline>
+        </w:drawing>
+      </w:r>
+    </w:p>
+    <w:p>
+      <w:r>
+        <w:rPr>
+          <w:noProof/>
+        </w:rPr>
+        <w:lastRenderedPageBreak/>
+        <w:drawing>
+          <wp:inline distT="0" distB="0" distL="0" distR="0" wp14:anchorId="74B27AE6" wp14:editId="7E21D1B2">
+            <wp:extent cx="5523809" cy="5133333"/>
+            <wp:effectExtent l="0" t="0" r="1270" b="0"/>
+            <wp:docPr id="1417019028" name="Imagen 1"/>
+            <wp:cNvGraphicFramePr>
+              <a:graphicFrameLocks xmlns:a="http://schemas.openxmlformats.org/drawingml/2006/main" noChangeAspect="1"/>
+            </wp:cNvGraphicFramePr>
+            <a:graphic xmlns:a="http://schemas.openxmlformats.org/drawingml/2006/main">
+              <a:graphicData uri="http://schemas.openxmlformats.org/drawingml/2006/picture">
+                <pic:pic xmlns:pic="http://schemas.openxmlformats.org/drawingml/2006/picture">
+                  <pic:nvPicPr>
+                    <pic:cNvPr id="1417019028" name=""/>
+                    <pic:cNvPicPr/>
+                  </pic:nvPicPr>
+                  <pic:blipFill>
+                    <a:blip r:embed="rId11"/>
+                    <a:stretch>
+                      <a:fillRect/>
+                    </a:stretch>
+                  </pic:blipFill>
+                  <pic:spPr>
+                    <a:xfrm>
+                      <a:off x="0" y="0"/>
+                      <a:ext cx="5523809" cy="5133333"/>
+                    </a:xfrm>
+                    <a:prstGeom prst="rect">
+                      <a:avLst/>
+                    </a:prstGeom>
+                  </pic:spPr>
+                </pic:pic>
+              </a:graphicData>
+            </a:graphic>
+          </wp:inline>
+        </w:drawing>
+      </w:r>
+    </w:p>
+    <w:p>
+      <w:r>
+        <w:rPr>
+          <w:noProof/>
+        </w:rPr>
+        <w:lastRenderedPageBreak/>
+        <w:drawing>
+          <wp:inline distT="0" distB="0" distL="0" distR="0" wp14:anchorId="4B05A76C" wp14:editId="32F4BCD7">
+            <wp:extent cx="4419048" cy="5028571"/>
+            <wp:effectExtent l="0" t="0" r="635" b="635"/>
+            <wp:docPr id="845995312" name="Imagen 1"/>
+            <wp:cNvGraphicFramePr>
+              <a:graphicFrameLocks xmlns:a="http://schemas.openxmlformats.org/drawingml/2006/main" noChangeAspect="1"/>
+            </wp:cNvGraphicFramePr>
+            <a:graphic xmlns:a="http://schemas.openxmlformats.org/drawingml/2006/main">
+              <a:graphicData uri="http://schemas.openxmlformats.org/drawingml/2006/picture">
+                <pic:pic xmlns:pic="http://schemas.openxmlformats.org/drawingml/2006/picture">
+                  <pic:nvPicPr>
+                    <pic:cNvPr id="845995312" name=""/>
                     <pic:cNvPicPr/>
                   </pic:nvPicPr>
                   <pic:blipFill>
@@ -583,7 +418,136 @@
                   <pic:spPr>
                     <a:xfrm>
                       <a:off x="0" y="0"/>
-                      <a:ext cx="5612130" cy="2230755"/>
+                      <a:ext cx="4419048" cy="5028571"/>
+                    </a:xfrm>
+                    <a:prstGeom prst="rect">
+                      <a:avLst/>
+                    </a:prstGeom>
+                  </pic:spPr>
+                </pic:pic>
+              </a:graphicData>
+            </a:graphic>
+          </wp:inline>
+        </w:drawing>
+      </w:r>
+    </w:p>
+    <w:p>
+      <w:r>
+        <w:rPr>
+          <w:noProof/>
+        </w:rPr>
+        <w:lastRenderedPageBreak/>
+        <w:drawing>
+          <wp:inline distT="0" distB="0" distL="0" distR="0" wp14:anchorId="1B43CC9D" wp14:editId="130D67E6">
+            <wp:extent cx="4980952" cy="5580952"/>
+            <wp:effectExtent l="0" t="0" r="0" b="1270"/>
+            <wp:docPr id="501175729" name="Imagen 1"/>
+            <wp:cNvGraphicFramePr>
+              <a:graphicFrameLocks xmlns:a="http://schemas.openxmlformats.org/drawingml/2006/main" noChangeAspect="1"/>
+            </wp:cNvGraphicFramePr>
+            <a:graphic xmlns:a="http://schemas.openxmlformats.org/drawingml/2006/main">
+              <a:graphicData uri="http://schemas.openxmlformats.org/drawingml/2006/picture">
+                <pic:pic xmlns:pic="http://schemas.openxmlformats.org/drawingml/2006/picture">
+                  <pic:nvPicPr>
+                    <pic:cNvPr id="501175729" name=""/>
+                    <pic:cNvPicPr/>
+                  </pic:nvPicPr>
+                  <pic:blipFill>
+                    <a:blip r:embed="rId13"/>
+                    <a:stretch>
+                      <a:fillRect/>
+                    </a:stretch>
+                  </pic:blipFill>
+                  <pic:spPr>
+                    <a:xfrm>
+                      <a:off x="0" y="0"/>
+                      <a:ext cx="4980952" cy="5580952"/>
+                    </a:xfrm>
+                    <a:prstGeom prst="rect">
+                      <a:avLst/>
+                    </a:prstGeom>
+                  </pic:spPr>
+                </pic:pic>
+              </a:graphicData>
+            </a:graphic>
+          </wp:inline>
+        </w:drawing>
+      </w:r>
+    </w:p>
+    <w:p>
+      <w:r>
+        <w:rPr>
+          <w:noProof/>
+        </w:rPr>
+        <w:lastRenderedPageBreak/>
+        <w:drawing>
+          <wp:inline distT="0" distB="0" distL="0" distR="0" wp14:anchorId="24EAFC4E" wp14:editId="65DE1559">
+            <wp:extent cx="4219048" cy="5542857"/>
+            <wp:effectExtent l="0" t="0" r="0" b="1270"/>
+            <wp:docPr id="781702752" name="Imagen 1"/>
+            <wp:cNvGraphicFramePr>
+              <a:graphicFrameLocks xmlns:a="http://schemas.openxmlformats.org/drawingml/2006/main" noChangeAspect="1"/>
+            </wp:cNvGraphicFramePr>
+            <a:graphic xmlns:a="http://schemas.openxmlformats.org/drawingml/2006/main">
+              <a:graphicData uri="http://schemas.openxmlformats.org/drawingml/2006/picture">
+                <pic:pic xmlns:pic="http://schemas.openxmlformats.org/drawingml/2006/picture">
+                  <pic:nvPicPr>
+                    <pic:cNvPr id="781702752" name=""/>
+                    <pic:cNvPicPr/>
+                  </pic:nvPicPr>
+                  <pic:blipFill>
+                    <a:blip r:embed="rId14"/>
+                    <a:stretch>
+                      <a:fillRect/>
+                    </a:stretch>
+                  </pic:blipFill>
+                  <pic:spPr>
+                    <a:xfrm>
+                      <a:off x="0" y="0"/>
+                      <a:ext cx="4219048" cy="5542857"/>
+                    </a:xfrm>
+                    <a:prstGeom prst="rect">
+                      <a:avLst/>
+                    </a:prstGeom>
+                  </pic:spPr>
+                </pic:pic>
+              </a:graphicData>
+            </a:graphic>
+          </wp:inline>
+        </w:drawing>
+      </w:r>
+    </w:p>
+    <w:p>
+      <w:r>
+        <w:rPr>
+          <w:noProof/>
+        </w:rPr>
+        <w:lastRenderedPageBreak/>
+        <w:drawing>
+          <wp:inline distT="0" distB="0" distL="0" distR="0" wp14:anchorId="0885FB07" wp14:editId="16FBEAD3">
+            <wp:extent cx="4733333" cy="4961905"/>
+            <wp:effectExtent l="0" t="0" r="0" b="0"/>
+            <wp:docPr id="606125336" name="Imagen 1"/>
+            <wp:cNvGraphicFramePr>
+              <a:graphicFrameLocks xmlns:a="http://schemas.openxmlformats.org/drawingml/2006/main" noChangeAspect="1"/>
+            </wp:cNvGraphicFramePr>
+            <a:graphic xmlns:a="http://schemas.openxmlformats.org/drawingml/2006/main">
+              <a:graphicData uri="http://schemas.openxmlformats.org/drawingml/2006/picture">
+                <pic:pic xmlns:pic="http://schemas.openxmlformats.org/drawingml/2006/picture">
+                  <pic:nvPicPr>
+                    <pic:cNvPr id="606125336" name=""/>
+                    <pic:cNvPicPr/>
+                  </pic:nvPicPr>
+                  <pic:blipFill>
+                    <a:blip r:embed="rId15"/>
+                    <a:stretch>
+                      <a:fillRect/>
+                    </a:stretch>
+                  </pic:blipFill>
+                  <pic:spPr>
+                    <a:xfrm>
+                      <a:off x="0" y="0"/>
+                      <a:ext cx="4733333" cy="4961905"/>
                     </a:xfrm>
                     <a:prstGeom prst="rect">
                       <a:avLst/>
@@ -1014,7 +978,7 @@
     <w:link w:val="Ttulo1Car"/>
     <w:uiPriority w:val="9"/>
     <w:qFormat/>
-    <w:rsid w:val="00161D7D"/>
+    <w:rsid w:val="000D3F6E"/>
     <w:pPr>
       <w:keepNext/>
       <w:keepLines/>
@@ -1037,7 +1001,7 @@
     <w:semiHidden/>
     <w:unhideWhenUsed/>
     <w:qFormat/>
-    <w:rsid w:val="00161D7D"/>
+    <w:rsid w:val="000D3F6E"/>
     <w:pPr>
       <w:keepNext/>
       <w:keepLines/>
@@ -1060,7 +1024,7 @@
     <w:semiHidden/>
     <w:unhideWhenUsed/>
     <w:qFormat/>
-    <w:rsid w:val="00161D7D"/>
+    <w:rsid w:val="000D3F6E"/>
     <w:pPr>
       <w:keepNext/>
       <w:keepLines/>
@@ -1083,7 +1047,7 @@
     <w:semiHidden/>
     <w:unhideWhenUsed/>
     <w:qFormat/>
-    <w:rsid w:val="00161D7D"/>
+    <w:rsid w:val="000D3F6E"/>
     <w:pPr>
       <w:keepNext/>
       <w:keepLines/>
@@ -1106,7 +1070,7 @@
     <w:semiHidden/>
     <w:unhideWhenUsed/>
     <w:qFormat/>
-    <w:rsid w:val="00161D7D"/>
+    <w:rsid w:val="000D3F6E"/>
     <w:pPr>
       <w:keepNext/>
       <w:keepLines/>
@@ -1127,7 +1091,7 @@
     <w:semiHidden/>
     <w:unhideWhenUsed/>
     <w:qFormat/>
-    <w:rsid w:val="00161D7D"/>
+    <w:rsid w:val="000D3F6E"/>
     <w:pPr>
       <w:keepNext/>
       <w:keepLines/>
@@ -1150,7 +1114,7 @@
     <w:semiHidden/>
     <w:unhideWhenUsed/>
     <w:qFormat/>
-    <w:rsid w:val="00161D7D"/>
+    <w:rsid w:val="000D3F6E"/>
     <w:pPr>
       <w:keepNext/>
       <w:keepLines/>
@@ -1171,7 +1135,7 @@
     <w:semiHidden/>
     <w:unhideWhenUsed/>
     <w:qFormat/>
-    <w:rsid w:val="00161D7D"/>
+    <w:rsid w:val="000D3F6E"/>
     <w:pPr>
       <w:keepNext/>
       <w:keepLines/>
@@ -1194,7 +1158,7 @@
     <w:semiHidden/>
     <w:unhideWhenUsed/>
     <w:qFormat/>
-    <w:rsid w:val="00161D7D"/>
+    <w:rsid w:val="000D3F6E"/>
     <w:pPr>
       <w:keepNext/>
       <w:keepLines/>
@@ -1238,7 +1202,7 @@
     <w:basedOn w:val="Fuentedeprrafopredeter"/>
     <w:link w:val="Ttulo1"/>
     <w:uiPriority w:val="9"/>
-    <w:rsid w:val="00161D7D"/>
+    <w:rsid w:val="000D3F6E"/>
     <w:rPr>
       <w:rFonts w:asciiTheme="majorHAnsi" w:eastAsiaTheme="majorEastAsia" w:hAnsiTheme="majorHAnsi" w:cstheme="majorBidi"/>
       <w:color w:val="0F4761" w:themeColor="accent1" w:themeShade="BF"/>
@@ -1252,7 +1216,7 @@
     <w:link w:val="Ttulo2"/>
     <w:uiPriority w:val="9"/>
     <w:semiHidden/>
-    <w:rsid w:val="00161D7D"/>
+    <w:rsid w:val="000D3F6E"/>
     <w:rPr>
       <w:rFonts w:asciiTheme="majorHAnsi" w:eastAsiaTheme="majorEastAsia" w:hAnsiTheme="majorHAnsi" w:cstheme="majorBidi"/>
       <w:color w:val="0F4761" w:themeColor="accent1" w:themeShade="BF"/>
@@ -1266,7 +1230,7 @@
     <w:link w:val="Ttulo3"/>
     <w:uiPriority w:val="9"/>
     <w:semiHidden/>
-    <w:rsid w:val="00161D7D"/>
+    <w:rsid w:val="000D3F6E"/>
     <w:rPr>
       <w:rFonts w:eastAsiaTheme="majorEastAsia" w:cstheme="majorBidi"/>
       <w:color w:val="0F4761" w:themeColor="accent1" w:themeShade="BF"/>
@@ -1280,7 +1244,7 @@
     <w:link w:val="Ttulo4"/>
     <w:uiPriority w:val="9"/>
     <w:semiHidden/>
-    <w:rsid w:val="00161D7D"/>
+    <w:rsid w:val="000D3F6E"/>
     <w:rPr>
       <w:rFonts w:eastAsiaTheme="majorEastAsia" w:cstheme="majorBidi"/>
       <w:i/>
@@ -1294,7 +1258,7 @@
     <w:link w:val="Ttulo5"/>
     <w:uiPriority w:val="9"/>
     <w:semiHidden/>
-    <w:rsid w:val="00161D7D"/>
+    <w:rsid w:val="000D3F6E"/>
     <w:rPr>
       <w:rFonts w:eastAsiaTheme="majorEastAsia" w:cstheme="majorBidi"/>
       <w:color w:val="0F4761" w:themeColor="accent1" w:themeShade="BF"/>
@@ -1306,7 +1270,7 @@
     <w:link w:val="Ttulo6"/>
     <w:uiPriority w:val="9"/>
     <w:semiHidden/>
-    <w:rsid w:val="00161D7D"/>
+    <w:rsid w:val="000D3F6E"/>
     <w:rPr>
       <w:rFonts w:eastAsiaTheme="majorEastAsia" w:cstheme="majorBidi"/>
       <w:i/>
@@ -1320,7 +1284,7 @@
     <w:link w:val="Ttulo7"/>
     <w:uiPriority w:val="9"/>
     <w:semiHidden/>
-    <w:rsid w:val="00161D7D"/>
+    <w:rsid w:val="000D3F6E"/>
     <w:rPr>
       <w:rFonts w:eastAsiaTheme="majorEastAsia" w:cstheme="majorBidi"/>
       <w:color w:val="595959" w:themeColor="text1" w:themeTint="A6"/>
@@ -1332,7 +1296,7 @@
     <w:link w:val="Ttulo8"/>
     <w:uiPriority w:val="9"/>
     <w:semiHidden/>
-    <w:rsid w:val="00161D7D"/>
+    <w:rsid w:val="000D3F6E"/>
     <w:rPr>
       <w:rFonts w:eastAsiaTheme="majorEastAsia" w:cstheme="majorBidi"/>
       <w:i/>
@@ -1346,7 +1310,7 @@
     <w:link w:val="Ttulo9"/>
     <w:uiPriority w:val="9"/>
     <w:semiHidden/>
-    <w:rsid w:val="00161D7D"/>
+    <w:rsid w:val="000D3F6E"/>
     <w:rPr>
       <w:rFonts w:eastAsiaTheme="majorEastAsia" w:cstheme="majorBidi"/>
       <w:color w:val="272727" w:themeColor="text1" w:themeTint="D8"/>
@@ -1359,7 +1323,7 @@
     <w:link w:val="TtuloCar"/>
     <w:uiPriority w:val="10"/>
     <w:qFormat/>
-    <w:rsid w:val="00161D7D"/>
+    <w:rsid w:val="000D3F6E"/>
     <w:pPr>
       <w:spacing w:after="80" w:line="240" w:lineRule="auto"/>
       <w:contextualSpacing/>
@@ -1377,7 +1341,7 @@
     <w:basedOn w:val="Fuentedeprrafopredeter"/>
     <w:link w:val="Ttulo"/>
     <w:uiPriority w:val="10"/>
-    <w:rsid w:val="00161D7D"/>
+    <w:rsid w:val="000D3F6E"/>
     <w:rPr>
       <w:rFonts w:asciiTheme="majorHAnsi" w:eastAsiaTheme="majorEastAsia" w:hAnsiTheme="majorHAnsi" w:cstheme="majorBidi"/>
       <w:spacing w:val="-10"/>
@@ -1393,7 +1357,7 @@
     <w:link w:val="SubttuloCar"/>
     <w:uiPriority w:val="11"/>
     <w:qFormat/>
-    <w:rsid w:val="00161D7D"/>
+    <w:rsid w:val="000D3F6E"/>
     <w:pPr>
       <w:numPr>
         <w:ilvl w:val="1"/>
@@ -1412,7 +1376,7 @@
     <w:basedOn w:val="Fuentedeprrafopredeter"/>
     <w:link w:val="Subttulo"/>
     <w:uiPriority w:val="11"/>
-    <w:rsid w:val="00161D7D"/>
+    <w:rsid w:val="000D3F6E"/>
     <w:rPr>
       <w:rFonts w:eastAsiaTheme="majorEastAsia" w:cstheme="majorBidi"/>
       <w:color w:val="595959" w:themeColor="text1" w:themeTint="A6"/>
@@ -1428,7 +1392,7 @@
     <w:link w:val="CitaCar"/>
     <w:uiPriority w:val="29"/>
     <w:qFormat/>
-    <w:rsid w:val="00161D7D"/>
+    <w:rsid w:val="000D3F6E"/>
     <w:pPr>
       <w:spacing w:before="160"/>
       <w:jc w:val="center"/>
@@ -1444,7 +1408,7 @@
     <w:basedOn w:val="Fuentedeprrafopredeter"/>
     <w:link w:val="Cita"/>
     <w:uiPriority w:val="29"/>
-    <w:rsid w:val="00161D7D"/>
+    <w:rsid w:val="000D3F6E"/>
     <w:rPr>
       <w:i/>
       <w:iCs/>
@@ -1456,7 +1420,7 @@
     <w:basedOn w:val="Normal"/>
     <w:uiPriority w:val="34"/>
     <w:qFormat/>
-    <w:rsid w:val="00161D7D"/>
+    <w:rsid w:val="000D3F6E"/>
     <w:pPr>
       <w:ind w:left="720"/>
       <w:contextualSpacing/>
@@ -1467,7 +1431,7 @@
     <w:basedOn w:val="Fuentedeprrafopredeter"/>
     <w:uiPriority w:val="21"/>
     <w:qFormat/>
-    <w:rsid w:val="00161D7D"/>
+    <w:rsid w:val="000D3F6E"/>
     <w:rPr>
       <w:i/>
       <w:iCs/>
@@ -1481,7 +1445,7 @@
     <w:link w:val="CitadestacadaCar"/>
     <w:uiPriority w:val="30"/>
     <w:qFormat/>
-    <w:rsid w:val="00161D7D"/>
+    <w:rsid w:val="000D3F6E"/>
     <w:pPr>
       <w:pBdr>
         <w:top w:val="single" w:sz="4" w:space="10" w:color="0F4761" w:themeColor="accent1" w:themeShade="BF"/>
@@ -1502,7 +1466,7 @@
     <w:basedOn w:val="Fuentedeprrafopredeter"/>
     <w:link w:val="Citadestacada"/>
     <w:uiPriority w:val="30"/>
-    <w:rsid w:val="00161D7D"/>
+    <w:rsid w:val="000D3F6E"/>
     <w:rPr>
       <w:i/>
       <w:iCs/>
@@ -1514,7 +1478,7 @@
     <w:basedOn w:val="Fuentedeprrafopredeter"/>
     <w:uiPriority w:val="32"/>
     <w:qFormat/>
-    <w:rsid w:val="00161D7D"/>
+    <w:rsid w:val="000D3F6E"/>
     <w:rPr>
       <w:b/>
       <w:bCs/>
@@ -1527,7 +1491,7 @@
 </file>
 
 <file path=word/theme/theme1.xml><?xml version="1.0" encoding="utf-8"?>
-<a:theme xmlns:a="http://schemas.openxmlformats.org/drawingml/2006/main" name="Office Theme">
+<a:theme xmlns:a="http://schemas.openxmlformats.org/drawingml/2006/main" name="Tema de Office">
   <a:themeElements>
     <a:clrScheme name="Office">
       <a:dk1>
@@ -1732,6 +1696,13 @@
         </a:gradFill>
       </a:fillStyleLst>
       <a:lnStyleLst>
+        <a:ln w="6350" cap="flat" cmpd="sng" algn="ctr">
+          <a:solidFill>
+            <a:schemeClr val="phClr"/>
+          </a:solidFill>
+          <a:prstDash val="solid"/>
+          <a:miter lim="800000"/>
+        </a:ln>
         <a:ln w="12700" cap="flat" cmpd="sng" algn="ctr">
           <a:solidFill>
             <a:schemeClr val="phClr"/>
@@ -1740,13 +1711,6 @@
           <a:miter lim="800000"/>
         </a:ln>
         <a:ln w="19050" cap="flat" cmpd="sng" algn="ctr">
-          <a:solidFill>
-            <a:schemeClr val="phClr"/>
-          </a:solidFill>
-          <a:prstDash val="solid"/>
-          <a:miter lim="800000"/>
-        </a:ln>
-        <a:ln w="25400" cap="flat" cmpd="sng" algn="ctr">
           <a:solidFill>
             <a:schemeClr val="phClr"/>
           </a:solidFill>
@@ -1811,27 +1775,7 @@
       </a:bgFillStyleLst>
     </a:fmtScheme>
   </a:themeElements>
-  <a:objectDefaults>
-    <a:lnDef>
-      <a:spPr/>
-      <a:bodyPr/>
-      <a:lstStyle/>
-      <a:style>
-        <a:lnRef idx="2">
-          <a:schemeClr val="accent1"/>
-        </a:lnRef>
-        <a:fillRef idx="0">
-          <a:schemeClr val="accent1"/>
-        </a:fillRef>
-        <a:effectRef idx="1">
-          <a:schemeClr val="accent1"/>
-        </a:effectRef>
-        <a:fontRef idx="minor">
-          <a:schemeClr val="tx1"/>
-        </a:fontRef>
-      </a:style>
-    </a:lnDef>
-  </a:objectDefaults>
+  <a:objectDefaults/>
   <a:extraClrSchemeLst/>
   <a:extLst>
     <a:ext uri="{05A4C25C-085E-4340-85A3-A5531E510DB2}">

</xml_diff>